<commit_message>
chore: update vscode environment screenshot with current clean project state
</commit_message>
<xml_diff>
--- a/FirstSemester/OperatingSystems/Lab1/Лемішка_ПП_14_Лаб_1.docx
+++ b/FirstSemester/OperatingSystems/Lab1/Лемішка_ПП_14_Лаб_1.docx
@@ -215,14 +215,15 @@
       </w:r>
     </w:p>
     <w:p>
+      <w:pPr>
+        <w:spacing w:after="200"/>
+      </w:pPr>
       <w:r>
         <w:br w:type="page"/>
       </w:r>
     </w:p>
     <w:p>
       <w:pPr>
-        <w:keepNext/>
-        <w:spacing w:before="240"/>
         <w:ind w:firstLine="709"/>
       </w:pPr>
       <w:r>

</xml_diff>